<commit_message>
Anpassung GDD und Button auf Hauptmenu für Tutorial
</commit_message>
<xml_diff>
--- a/wild-jam-april-2026/__ORGA/Game Design Dokument.docx
+++ b/wild-jam-april-2026/__ORGA/Game Design Dokument.docx
@@ -591,11 +591,24 @@
         <w:p/>
         <w:p/>
         <w:p>
-          <w:r>
+          <w:pPr>
             <w:rPr>
               <w:rStyle w:val="berschrift2Zchn"/>
             </w:rPr>
+          </w:pPr>
+          <w:r>
+            <w:rPr>
+              <w:rStyle w:val="berschrift2Zchn"/>
+            </w:rPr>
             <w:t>Story</w:t>
+          </w:r>
+        </w:p>
+        <w:p>
+          <w:r>
+            <w:t>Der Haupt-Character</w:t>
+          </w:r>
+          <w:r>
+            <w:t xml:space="preserve"> Silvester arbeitet in einem Büro. In seiner Mittagspause darf er jedoch nie Pause machen, sondern ist dazu verdonnert seinem Chef Johnny in der gemeinsamen Office-Küche all seine Wünsche zu erfüllen.</w:t>
           </w:r>
         </w:p>
         <w:p/>
@@ -632,7 +645,6 @@
               <w:sz w:val="32"/>
               <w:szCs w:val="32"/>
             </w:rPr>
-            <w:lastRenderedPageBreak/>
             <w:t>Level Design</w:t>
           </w:r>
         </w:p>
@@ -690,45 +702,279 @@
               <w:sz w:val="32"/>
               <w:szCs w:val="32"/>
             </w:rPr>
-            <w:t>Menus</w:t>
+            <w:drawing>
+              <wp:inline distT="0" distB="0" distL="0" distR="0" wp14:anchorId="5FC77FAB" wp14:editId="32AC685B">
+                <wp:extent cx="5229225" cy="2932216"/>
+                <wp:effectExtent l="0" t="0" r="0" b="1905"/>
+                <wp:docPr id="2146106500" name="Grafik 1"/>
+                <wp:cNvGraphicFramePr>
+                  <a:graphicFrameLocks xmlns:a="http://schemas.openxmlformats.org/drawingml/2006/main" noChangeAspect="1"/>
+                </wp:cNvGraphicFramePr>
+                <a:graphic xmlns:a="http://schemas.openxmlformats.org/drawingml/2006/main">
+                  <a:graphicData uri="http://schemas.openxmlformats.org/drawingml/2006/picture">
+                    <pic:pic xmlns:pic="http://schemas.openxmlformats.org/drawingml/2006/picture">
+                      <pic:nvPicPr>
+                        <pic:cNvPr id="2146106500" name=""/>
+                        <pic:cNvPicPr/>
+                      </pic:nvPicPr>
+                      <pic:blipFill>
+                        <a:blip r:embed="rId5"/>
+                        <a:stretch>
+                          <a:fillRect/>
+                        </a:stretch>
+                      </pic:blipFill>
+                      <pic:spPr>
+                        <a:xfrm>
+                          <a:off x="0" y="0"/>
+                          <a:ext cx="5241878" cy="2939311"/>
+                        </a:xfrm>
+                        <a:prstGeom prst="rect">
+                          <a:avLst/>
+                        </a:prstGeom>
+                      </pic:spPr>
+                    </pic:pic>
+                  </a:graphicData>
+                </a:graphic>
+              </wp:inline>
+            </w:drawing>
           </w:r>
         </w:p>
         <w:p>
           <w:pPr>
-            <w:rPr>
-              <w:rStyle w:val="berschrift2Zchn"/>
-            </w:rPr>
-          </w:pPr>
-          <w:proofErr w:type="spellStart"/>
-          <w:r>
             <w:rPr>
               <w:rFonts w:asciiTheme="majorHAnsi" w:eastAsiaTheme="majorEastAsia" w:hAnsiTheme="majorHAnsi" w:cstheme="majorBidi"/>
               <w:color w:val="0F4761" w:themeColor="accent1" w:themeShade="BF"/>
               <w:sz w:val="32"/>
               <w:szCs w:val="32"/>
             </w:rPr>
-            <w:t>Camera</w:t>
-          </w:r>
-          <w:proofErr w:type="spellEnd"/>
-        </w:p>
-        <w:p>
-          <w:pPr>
+          </w:pPr>
+          <w:r>
+            <w:t>Während des Spielens hat unsere UI 5 Bereiche, die dem Spieler Informationen liefern:</w:t>
+          </w:r>
+        </w:p>
+        <w:tbl>
+          <w:tblPr>
+            <w:tblStyle w:val="Tabellenraster"/>
+            <w:tblW w:w="0" w:type="auto"/>
+            <w:tblLook w:val="04A0" w:firstRow="1" w:lastRow="0" w:firstColumn="1" w:lastColumn="0" w:noHBand="0" w:noVBand="1"/>
+          </w:tblPr>
+          <w:tblGrid>
+            <w:gridCol w:w="1271"/>
+            <w:gridCol w:w="7791"/>
+          </w:tblGrid>
+          <w:tr>
+            <w:tc>
+              <w:tcPr>
+                <w:tcW w:w="1271" w:type="dxa"/>
+              </w:tcPr>
+              <w:p>
+                <w:r>
+                  <w:t>1</w:t>
+                </w:r>
+              </w:p>
+            </w:tc>
+            <w:tc>
+              <w:tcPr>
+                <w:tcW w:w="7791" w:type="dxa"/>
+              </w:tcPr>
+              <w:p>
+                <w:r>
+                  <w:t xml:space="preserve">Anzeige der Zeit, die der Spieler noch </w:t>
+                </w:r>
+                <w:proofErr w:type="gramStart"/>
+                <w:r>
+                  <w:t>übrig hat</w:t>
+                </w:r>
+                <w:proofErr w:type="gramEnd"/>
+                <w:r>
+                  <w:t>.</w:t>
+                </w:r>
+              </w:p>
+            </w:tc>
+          </w:tr>
+          <w:tr>
+            <w:tc>
+              <w:tcPr>
+                <w:tcW w:w="1271" w:type="dxa"/>
+              </w:tcPr>
+              <w:p>
+                <w:r>
+                  <w:t>2</w:t>
+                </w:r>
+              </w:p>
+            </w:tc>
+            <w:tc>
+              <w:tcPr>
+                <w:tcW w:w="7791" w:type="dxa"/>
+              </w:tcPr>
+              <w:p>
+                <w:r>
+                  <w:t>Welchen Gegenstand der Spieler gerade Johnny bringen soll.</w:t>
+                </w:r>
+              </w:p>
+            </w:tc>
+          </w:tr>
+          <w:tr>
+            <w:tc>
+              <w:tcPr>
+                <w:tcW w:w="1271" w:type="dxa"/>
+              </w:tcPr>
+              <w:p>
+                <w:r>
+                  <w:t>3</w:t>
+                </w:r>
+              </w:p>
+            </w:tc>
+            <w:tc>
+              <w:tcPr>
+                <w:tcW w:w="7791" w:type="dxa"/>
+              </w:tcPr>
+              <w:p>
+                <w:r>
+                  <w:t>Der aktuelle Punktestand</w:t>
+                </w:r>
+              </w:p>
+            </w:tc>
+          </w:tr>
+          <w:tr>
+            <w:tc>
+              <w:tcPr>
+                <w:tcW w:w="1271" w:type="dxa"/>
+              </w:tcPr>
+              <w:p>
+                <w:r>
+                  <w:t>4</w:t>
+                </w:r>
+              </w:p>
+            </w:tc>
+            <w:tc>
+              <w:tcPr>
+                <w:tcW w:w="7791" w:type="dxa"/>
+              </w:tcPr>
+              <w:p>
+                <w:r>
+                  <w:t>Die Schwierigkeit mit Dropdown, so dass diese umgestellt werden kann.</w:t>
+                </w:r>
+              </w:p>
+            </w:tc>
+          </w:tr>
+          <w:tr>
+            <w:tc>
+              <w:tcPr>
+                <w:tcW w:w="1271" w:type="dxa"/>
+              </w:tcPr>
+              <w:p>
+                <w:r>
+                  <w:t>5</w:t>
+                </w:r>
+              </w:p>
+            </w:tc>
+            <w:tc>
+              <w:tcPr>
+                <w:tcW w:w="7791" w:type="dxa"/>
+              </w:tcPr>
+              <w:p>
+                <w:r>
+                  <w:t xml:space="preserve">Ein „How </w:t>
+                </w:r>
+                <w:proofErr w:type="spellStart"/>
+                <w:r>
+                  <w:t>to</w:t>
+                </w:r>
+                <w:proofErr w:type="spellEnd"/>
+                <w:r>
+                  <w:t xml:space="preserve"> </w:t>
+                </w:r>
+                <w:proofErr w:type="spellStart"/>
+                <w:r>
+                  <w:t>play</w:t>
+                </w:r>
+                <w:proofErr w:type="spellEnd"/>
+                <w:r>
+                  <w:t>“-Button und der „Zurück zum Hauptmenu“-Button</w:t>
+                </w:r>
+              </w:p>
+            </w:tc>
+          </w:tr>
+        </w:tbl>
+        <w:p/>
+        <w:p>
+          <w:r>
             <w:rPr>
               <w:rFonts w:asciiTheme="majorHAnsi" w:eastAsiaTheme="majorEastAsia" w:hAnsiTheme="majorHAnsi" w:cstheme="majorBidi"/>
               <w:color w:val="0F4761" w:themeColor="accent1" w:themeShade="BF"/>
               <w:sz w:val="32"/>
               <w:szCs w:val="32"/>
             </w:rPr>
-          </w:pPr>
-          <w:r>
+            <w:drawing>
+              <wp:anchor distT="0" distB="0" distL="114300" distR="114300" simplePos="0" relativeHeight="251660288" behindDoc="0" locked="0" layoutInCell="1" allowOverlap="1" wp14:anchorId="5B8E28B3" wp14:editId="35187A5F">
+                <wp:simplePos x="0" y="0"/>
+                <wp:positionH relativeFrom="margin">
+                  <wp:align>left</wp:align>
+                </wp:positionH>
+                <wp:positionV relativeFrom="paragraph">
+                  <wp:posOffset>524510</wp:posOffset>
+                </wp:positionV>
+                <wp:extent cx="1733550" cy="2066290"/>
+                <wp:effectExtent l="0" t="0" r="0" b="0"/>
+                <wp:wrapTopAndBottom/>
+                <wp:docPr id="1407566965" name="Grafik 1"/>
+                <wp:cNvGraphicFramePr>
+                  <a:graphicFrameLocks xmlns:a="http://schemas.openxmlformats.org/drawingml/2006/main" noChangeAspect="1"/>
+                </wp:cNvGraphicFramePr>
+                <a:graphic xmlns:a="http://schemas.openxmlformats.org/drawingml/2006/main">
+                  <a:graphicData uri="http://schemas.openxmlformats.org/drawingml/2006/picture">
+                    <pic:pic xmlns:pic="http://schemas.openxmlformats.org/drawingml/2006/picture">
+                      <pic:nvPicPr>
+                        <pic:cNvPr id="1407566965" name=""/>
+                        <pic:cNvPicPr/>
+                      </pic:nvPicPr>
+                      <pic:blipFill>
+                        <a:blip r:embed="rId6">
+                          <a:extLst>
+                            <a:ext uri="{28A0092B-C50C-407E-A947-70E740481C1C}">
+                              <a14:useLocalDpi xmlns:a14="http://schemas.microsoft.com/office/drawing/2010/main" val="0"/>
+                            </a:ext>
+                          </a:extLst>
+                        </a:blip>
+                        <a:stretch>
+                          <a:fillRect/>
+                        </a:stretch>
+                      </pic:blipFill>
+                      <pic:spPr>
+                        <a:xfrm>
+                          <a:off x="0" y="0"/>
+                          <a:ext cx="1733550" cy="2066290"/>
+                        </a:xfrm>
+                        <a:prstGeom prst="rect">
+                          <a:avLst/>
+                        </a:prstGeom>
+                      </pic:spPr>
+                    </pic:pic>
+                  </a:graphicData>
+                </a:graphic>
+                <wp14:sizeRelH relativeFrom="margin">
+                  <wp14:pctWidth>0</wp14:pctWidth>
+                </wp14:sizeRelH>
+                <wp14:sizeRelV relativeFrom="margin">
+                  <wp14:pctHeight>0</wp14:pctHeight>
+                </wp14:sizeRelV>
+              </wp:anchor>
+            </w:drawing>
+          </w:r>
+          <w:r>
+            <w:t>Zusätzlich sieht der Spieler durch die Einblendung des „S“-Buttons, mit welchem Gegenstand er in diesem Moment interagieren kann:</w:t>
+          </w:r>
+        </w:p>
+        <w:p>
+          <w:pPr>
             <w:rPr>
               <w:rFonts w:asciiTheme="majorHAnsi" w:eastAsiaTheme="majorEastAsia" w:hAnsiTheme="majorHAnsi" w:cstheme="majorBidi"/>
               <w:color w:val="0F4761" w:themeColor="accent1" w:themeShade="BF"/>
               <w:sz w:val="32"/>
               <w:szCs w:val="32"/>
             </w:rPr>
-            <w:t>Controls</w:t>
-          </w:r>
+          </w:pPr>
         </w:p>
         <w:p>
           <w:pPr>
@@ -739,25 +985,163 @@
               <w:szCs w:val="32"/>
             </w:rPr>
           </w:pPr>
-          <w:r>
+        </w:p>
+        <w:p>
+          <w:pPr>
             <w:rPr>
               <w:rFonts w:asciiTheme="majorHAnsi" w:eastAsiaTheme="majorEastAsia" w:hAnsiTheme="majorHAnsi" w:cstheme="majorBidi"/>
               <w:color w:val="0F4761" w:themeColor="accent1" w:themeShade="BF"/>
               <w:sz w:val="32"/>
               <w:szCs w:val="32"/>
             </w:rPr>
+          </w:pPr>
+          <w:r>
+            <w:rPr>
+              <w:rFonts w:asciiTheme="majorHAnsi" w:eastAsiaTheme="majorEastAsia" w:hAnsiTheme="majorHAnsi" w:cstheme="majorBidi"/>
+              <w:color w:val="0F4761" w:themeColor="accent1" w:themeShade="BF"/>
+              <w:sz w:val="32"/>
+              <w:szCs w:val="32"/>
+            </w:rPr>
+            <w:t>Menus</w:t>
+          </w:r>
+        </w:p>
+        <w:p>
+          <w:r>
+            <w:t>Das Hauptmenu hat drei Buttons, mit denen der Spieler 1. Die Schwierigkeit des Spiels festlegen, 2. das Spiel starten 3. lernen, wie man das Spiel spielen soll und 4. das Einstellungsmenu aufrufen kann.</w:t>
+          </w:r>
+          <w:r>
+            <w:br/>
+            <w:t>Im Einstellungsmenu kann der Spieler die Lautstärke des Spiels konfigurieren.</w:t>
+          </w:r>
+        </w:p>
+        <w:p>
+          <w:pPr>
+            <w:rPr>
+              <w:rFonts w:asciiTheme="majorHAnsi" w:eastAsiaTheme="majorEastAsia" w:hAnsiTheme="majorHAnsi" w:cstheme="majorBidi"/>
+              <w:color w:val="0F4761" w:themeColor="accent1" w:themeShade="BF"/>
+              <w:sz w:val="32"/>
+              <w:szCs w:val="32"/>
+            </w:rPr>
+          </w:pPr>
+        </w:p>
+        <w:p>
+          <w:pPr>
+            <w:rPr>
+              <w:rFonts w:asciiTheme="majorHAnsi" w:eastAsiaTheme="majorEastAsia" w:hAnsiTheme="majorHAnsi" w:cstheme="majorBidi"/>
+              <w:color w:val="0F4761" w:themeColor="accent1" w:themeShade="BF"/>
+              <w:sz w:val="32"/>
+              <w:szCs w:val="32"/>
+            </w:rPr>
+          </w:pPr>
+          <w:r>
+            <w:rPr>
+              <w:rFonts w:asciiTheme="majorHAnsi" w:eastAsiaTheme="majorEastAsia" w:hAnsiTheme="majorHAnsi" w:cstheme="majorBidi"/>
+              <w:color w:val="0F4761" w:themeColor="accent1" w:themeShade="BF"/>
+              <w:sz w:val="32"/>
+              <w:szCs w:val="32"/>
+            </w:rPr>
+            <w:t>K</w:t>
+          </w:r>
+          <w:r>
+            <w:rPr>
+              <w:rFonts w:asciiTheme="majorHAnsi" w:eastAsiaTheme="majorEastAsia" w:hAnsiTheme="majorHAnsi" w:cstheme="majorBidi"/>
+              <w:color w:val="0F4761" w:themeColor="accent1" w:themeShade="BF"/>
+              <w:sz w:val="32"/>
+              <w:szCs w:val="32"/>
+            </w:rPr>
+            <w:t>amera</w:t>
+          </w:r>
+        </w:p>
+        <w:p>
+          <w:r>
+            <w:t>Die Kamera ist eine fixe Perspektive auf die gesamte Küche/Scene.</w:t>
+          </w:r>
+        </w:p>
+        <w:p/>
+        <w:p>
+          <w:pPr>
+            <w:rPr>
+              <w:rFonts w:asciiTheme="majorHAnsi" w:eastAsiaTheme="majorEastAsia" w:hAnsiTheme="majorHAnsi" w:cstheme="majorBidi"/>
+              <w:color w:val="0F4761" w:themeColor="accent1" w:themeShade="BF"/>
+              <w:sz w:val="32"/>
+              <w:szCs w:val="32"/>
+            </w:rPr>
+          </w:pPr>
+          <w:r>
+            <w:rPr>
+              <w:rFonts w:asciiTheme="majorHAnsi" w:eastAsiaTheme="majorEastAsia" w:hAnsiTheme="majorHAnsi" w:cstheme="majorBidi"/>
+              <w:color w:val="0F4761" w:themeColor="accent1" w:themeShade="BF"/>
+              <w:sz w:val="32"/>
+              <w:szCs w:val="32"/>
+            </w:rPr>
+            <w:t>Controls</w:t>
+          </w:r>
+        </w:p>
+        <w:p>
+          <w:r>
+            <w:t xml:space="preserve">Die genutzten Buttons sind die </w:t>
+          </w:r>
+          <w:proofErr w:type="spellStart"/>
+          <w:r>
+            <w:t>default</w:t>
+          </w:r>
+          <w:proofErr w:type="spellEnd"/>
+          <w:r>
+            <w:t xml:space="preserve"> </w:t>
+          </w:r>
+          <w:proofErr w:type="spellStart"/>
+          <w:r>
+            <w:t>presets</w:t>
+          </w:r>
+          <w:proofErr w:type="spellEnd"/>
+          <w:r>
+            <w:t xml:space="preserve"> von Godot und </w:t>
+          </w:r>
+          <w:r>
+            <w:t>unsere Interaktions-Control</w:t>
+          </w:r>
+          <w:r>
+            <w:t xml:space="preserve"> </w:t>
+          </w:r>
+          <w:r>
+            <w:t xml:space="preserve">„S“. Dieser </w:t>
+          </w:r>
+          <w:r>
+            <w:t xml:space="preserve">Control </w:t>
+          </w:r>
+          <w:r>
+            <w:t>ermöglicht es dem Spieler mit Gegenständen und dem fallenden Obst zu interagieren/aufzufangen.</w:t>
+          </w:r>
+          <w:r>
+            <w:t xml:space="preserve"> Abgesehen von dieser Control haben wir noch die Shift-Taste belegt, mit der der Spieler schneller laufen kann.</w:t>
+          </w:r>
+          <w:r>
+            <w:br/>
+          </w:r>
+        </w:p>
+        <w:p>
+          <w:pPr>
+            <w:rPr>
+              <w:rFonts w:asciiTheme="majorHAnsi" w:eastAsiaTheme="majorEastAsia" w:hAnsiTheme="majorHAnsi" w:cstheme="majorBidi"/>
+              <w:color w:val="0F4761" w:themeColor="accent1" w:themeShade="BF"/>
+              <w:sz w:val="32"/>
+              <w:szCs w:val="32"/>
+            </w:rPr>
+          </w:pPr>
+          <w:r>
+            <w:rPr>
+              <w:rFonts w:asciiTheme="majorHAnsi" w:eastAsiaTheme="majorEastAsia" w:hAnsiTheme="majorHAnsi" w:cstheme="majorBidi"/>
+              <w:color w:val="0F4761" w:themeColor="accent1" w:themeShade="BF"/>
+              <w:sz w:val="32"/>
+              <w:szCs w:val="32"/>
+            </w:rPr>
             <w:t>Audio</w:t>
           </w:r>
         </w:p>
         <w:p>
           <w:r>
-            <w:t xml:space="preserve">Einfacher 4-bar Loop als Hintergrundmusik und Musik Effekte für die einzelnen </w:t>
-          </w:r>
-          <w:proofErr w:type="spellStart"/>
-          <w:r>
-            <w:t>Geräte.</w:t>
-          </w:r>
-          <w:proofErr w:type="spellEnd"/>
+            <w:t>Einfacher 4-bar Loop als Hintergrundmusik und Musik Effekte für die einzelnen Geräte.</w:t>
+          </w:r>
         </w:p>
         <w:p/>
         <w:p>
@@ -1398,6 +1782,7 @@
   <w:style w:type="character" w:default="1" w:styleId="Absatz-Standardschriftart">
     <w:name w:val="Default Paragraph Font"/>
     <w:uiPriority w:val="1"/>
+    <w:semiHidden/>
     <w:unhideWhenUsed/>
   </w:style>
   <w:style w:type="table" w:default="1" w:styleId="NormaleTabelle">
@@ -1765,6 +2150,25 @@
       <w:color w:val="605E5C"/>
       <w:shd w:val="clear" w:color="auto" w:fill="E1DFDD"/>
     </w:rPr>
+  </w:style>
+  <w:style w:type="table" w:styleId="Tabellenraster">
+    <w:name w:val="Table Grid"/>
+    <w:basedOn w:val="NormaleTabelle"/>
+    <w:uiPriority w:val="39"/>
+    <w:rsid w:val="001D4F99"/>
+    <w:pPr>
+      <w:spacing w:after="0" w:line="240" w:lineRule="auto"/>
+    </w:pPr>
+    <w:tblPr>
+      <w:tblBorders>
+        <w:top w:val="single" w:sz="4" w:space="0" w:color="auto"/>
+        <w:left w:val="single" w:sz="4" w:space="0" w:color="auto"/>
+        <w:bottom w:val="single" w:sz="4" w:space="0" w:color="auto"/>
+        <w:right w:val="single" w:sz="4" w:space="0" w:color="auto"/>
+        <w:insideH w:val="single" w:sz="4" w:space="0" w:color="auto"/>
+        <w:insideV w:val="single" w:sz="4" w:space="0" w:color="auto"/>
+      </w:tblBorders>
+    </w:tblPr>
   </w:style>
 </w:styles>
 </file>
@@ -1897,11 +2301,13 @@
     <w:rsidRoot w:val="00B52D4C"/>
     <w:rsid w:val="0003574A"/>
     <w:rsid w:val="00047698"/>
+    <w:rsid w:val="00263FDE"/>
     <w:rsid w:val="00460AE2"/>
     <w:rsid w:val="00596CD6"/>
     <w:rsid w:val="00943753"/>
     <w:rsid w:val="00980E1E"/>
     <w:rsid w:val="00B52D4C"/>
+    <w:rsid w:val="00EF1D47"/>
     <w:rsid w:val="00FE557F"/>
   </w:rsids>
   <m:mathPr>

</xml_diff>